<commit_message>
Feat : Création réponses Exercice 3
</commit_message>
<xml_diff>
--- a/Exercice Algorithmie 2.docx
+++ b/Exercice Algorithmie 2.docx
@@ -374,6 +374,28 @@
           <w:rFonts w:ascii="inherit" w:hAnsi="inherit"/>
           <w:bdr w:val="none" w:sz="0" w:space="0" w:color="auto" w:frame="1"/>
         </w:rPr>
+        <w:t>Fin Si</w:t>
+      </w:r>
+    </w:p>
+    <w:p>
+      <w:pPr>
+        <w:pStyle w:val="Paragraphedeliste"/>
+        <w:numPr>
+          <w:ilvl w:val="0"/>
+          <w:numId w:val="11"/>
+        </w:numPr>
+        <w:spacing w:line="240" w:lineRule="auto"/>
+        <w:textAlignment w:val="baseline"/>
+        <w:rPr>
+          <w:rFonts w:ascii="inherit" w:hAnsi="inherit"/>
+          <w:bdr w:val="none" w:sz="0" w:space="0" w:color="auto" w:frame="1"/>
+        </w:rPr>
+      </w:pPr>
+      <w:r>
+        <w:rPr>
+          <w:rFonts w:ascii="inherit" w:hAnsi="inherit"/>
+          <w:bdr w:val="none" w:sz="0" w:space="0" w:color="auto" w:frame="1"/>
+        </w:rPr>
         <w:t xml:space="preserve">Détruire </w:t>
       </w:r>
       <w:proofErr w:type="spellStart"/>
@@ -765,16 +787,14 @@
         <w:rPr>
           <w:rFonts w:ascii="inherit" w:hAnsi="inherit"/>
         </w:rPr>
-        <w:t xml:space="preserve"> mot de </w:t>
-      </w:r>
-      <w:proofErr w:type="spellStart"/>
-      <w:r>
-        <w:rPr>
-          <w:rFonts w:ascii="inherit" w:hAnsi="inherit"/>
-        </w:rPr>
-        <w:t>passse</w:t>
-      </w:r>
-      <w:proofErr w:type="spellEnd"/>
+        <w:t xml:space="preserve"> mot de pas</w:t>
+      </w:r>
+      <w:r>
+        <w:rPr>
+          <w:rFonts w:ascii="inherit" w:hAnsi="inherit"/>
+        </w:rPr>
+        <w:t>se</w:t>
+      </w:r>
     </w:p>
     <w:p>
       <w:pPr>
@@ -932,6 +952,26 @@
     </w:p>
     <w:p>
       <w:pPr>
+        <w:pStyle w:val="Paragraphedeliste"/>
+        <w:numPr>
+          <w:ilvl w:val="0"/>
+          <w:numId w:val="12"/>
+        </w:numPr>
+        <w:spacing w:line="240" w:lineRule="auto"/>
+        <w:textAlignment w:val="baseline"/>
+        <w:rPr>
+          <w:rFonts w:ascii="inherit" w:hAnsi="inherit"/>
+        </w:rPr>
+      </w:pPr>
+      <w:r>
+        <w:rPr>
+          <w:rFonts w:ascii="inherit" w:hAnsi="inherit"/>
+        </w:rPr>
+        <w:t>Fin Si</w:t>
+      </w:r>
+    </w:p>
+    <w:p>
+      <w:pPr>
         <w:spacing w:line="240" w:lineRule="auto"/>
         <w:textAlignment w:val="baseline"/>
         <w:rPr>
@@ -1537,341 +1577,373 @@
     </w:p>
     <w:p>
       <w:pPr>
-        <w:spacing w:line="240" w:lineRule="auto"/>
-        <w:textAlignment w:val="baseline"/>
-        <w:rPr>
-          <w:rFonts w:ascii="inherit" w:hAnsi="inherit"/>
-        </w:rPr>
-      </w:pPr>
-    </w:p>
-    <w:p>
-      <w:pPr>
-        <w:spacing w:line="240" w:lineRule="auto"/>
-        <w:textAlignment w:val="baseline"/>
-        <w:rPr>
-          <w:rFonts w:ascii="inherit" w:hAnsi="inherit"/>
-        </w:rPr>
-      </w:pPr>
-    </w:p>
-    <w:p>
-      <w:pPr>
-        <w:spacing w:line="240" w:lineRule="auto"/>
-        <w:textAlignment w:val="baseline"/>
-        <w:rPr>
-          <w:rFonts w:ascii="inherit" w:hAnsi="inherit"/>
-        </w:rPr>
-      </w:pPr>
+        <w:pStyle w:val="Paragraphedeliste"/>
+        <w:numPr>
+          <w:ilvl w:val="0"/>
+          <w:numId w:val="13"/>
+        </w:numPr>
+        <w:spacing w:line="240" w:lineRule="auto"/>
+        <w:textAlignment w:val="baseline"/>
+        <w:rPr>
+          <w:rFonts w:ascii="inherit" w:hAnsi="inherit"/>
+        </w:rPr>
+      </w:pPr>
+      <w:r>
+        <w:rPr>
+          <w:rFonts w:ascii="inherit" w:hAnsi="inherit"/>
+        </w:rPr>
+        <w:t>Fin Si</w:t>
+      </w:r>
+    </w:p>
+    <w:p>
+      <w:pPr>
+        <w:spacing w:line="240" w:lineRule="auto"/>
+        <w:textAlignment w:val="baseline"/>
+        <w:rPr>
+          <w:rFonts w:ascii="inherit" w:hAnsi="inherit"/>
+        </w:rPr>
+      </w:pPr>
+    </w:p>
+    <w:p>
+      <w:pPr>
+        <w:spacing w:line="240" w:lineRule="auto"/>
+        <w:textAlignment w:val="baseline"/>
+        <w:rPr>
+          <w:rFonts w:ascii="inherit" w:hAnsi="inherit"/>
+        </w:rPr>
+      </w:pPr>
+    </w:p>
+    <w:p>
+      <w:pPr>
+        <w:spacing w:line="240" w:lineRule="auto"/>
+        <w:textAlignment w:val="baseline"/>
+        <w:rPr>
+          <w:rFonts w:ascii="inherit" w:hAnsi="inherit"/>
+        </w:rPr>
+      </w:pPr>
+    </w:p>
+    <w:p>
+      <w:pPr>
+        <w:spacing w:line="240" w:lineRule="auto"/>
+        <w:textAlignment w:val="baseline"/>
+        <w:rPr>
+          <w:rFonts w:ascii="inherit" w:hAnsi="inherit"/>
+        </w:rPr>
+      </w:pPr>
+    </w:p>
+    <w:p>
+      <w:pPr>
+        <w:pStyle w:val="Titre1"/>
+        <w:spacing w:before="0" w:after="0" w:line="330" w:lineRule="atLeast"/>
+        <w:textAlignment w:val="baseline"/>
+        <w:rPr>
+          <w:rFonts w:ascii="Helvetica" w:hAnsi="Helvetica"/>
+        </w:rPr>
+      </w:pPr>
+      <w:r>
+        <w:rPr>
+          <w:rFonts w:ascii="inherit" w:hAnsi="inherit"/>
+          <w:sz w:val="36"/>
+          <w:szCs w:val="36"/>
+          <w:bdr w:val="none" w:sz="0" w:space="0" w:color="auto" w:frame="1"/>
+        </w:rPr>
+        <w:t>Exercice 4 : Feu tricolore</w:t>
+      </w:r>
+    </w:p>
+    <w:p>
+      <w:pPr>
+        <w:rPr>
+          <w:rFonts w:ascii="Times New Roman" w:hAnsi="Times New Roman"/>
+        </w:rPr>
+      </w:pPr>
+      <w:r>
+        <w:rPr>
+          <w:rFonts w:ascii="Helvetica" w:hAnsi="Helvetica"/>
+          <w:bdr w:val="none" w:sz="0" w:space="0" w:color="auto" w:frame="1"/>
+        </w:rPr>
+        <w:t xml:space="preserve">Ecrire un algorithme en </w:t>
+      </w:r>
+      <w:proofErr w:type="spellStart"/>
+      <w:r>
+        <w:rPr>
+          <w:rFonts w:ascii="Helvetica" w:hAnsi="Helvetica"/>
+          <w:bdr w:val="none" w:sz="0" w:space="0" w:color="auto" w:frame="1"/>
+        </w:rPr>
+        <w:t>pseudo-code</w:t>
+      </w:r>
+      <w:proofErr w:type="spellEnd"/>
+      <w:r>
+        <w:rPr>
+          <w:rFonts w:ascii="Helvetica" w:hAnsi="Helvetica"/>
+          <w:bdr w:val="none" w:sz="0" w:space="0" w:color="auto" w:frame="1"/>
+        </w:rPr>
+        <w:t xml:space="preserve"> pour : </w:t>
+      </w:r>
+    </w:p>
+    <w:p>
+      <w:pPr>
+        <w:numPr>
+          <w:ilvl w:val="0"/>
+          <w:numId w:val="14"/>
+        </w:numPr>
+        <w:spacing w:line="240" w:lineRule="auto"/>
+        <w:ind w:left="0"/>
+        <w:textAlignment w:val="baseline"/>
+        <w:rPr>
+          <w:rFonts w:ascii="inherit" w:hAnsi="inherit"/>
+        </w:rPr>
+      </w:pPr>
+      <w:r>
+        <w:rPr>
+          <w:rFonts w:ascii="inherit" w:hAnsi="inherit"/>
+          <w:bdr w:val="none" w:sz="0" w:space="0" w:color="auto" w:frame="1"/>
+        </w:rPr>
+        <w:t>Entrée : couleur du feu</w:t>
+      </w:r>
+    </w:p>
+    <w:p>
+      <w:pPr>
+        <w:numPr>
+          <w:ilvl w:val="0"/>
+          <w:numId w:val="14"/>
+        </w:numPr>
+        <w:spacing w:line="240" w:lineRule="auto"/>
+        <w:ind w:left="0"/>
+        <w:textAlignment w:val="baseline"/>
+        <w:rPr>
+          <w:rFonts w:ascii="inherit" w:hAnsi="inherit"/>
+        </w:rPr>
+      </w:pPr>
+      <w:r>
+        <w:rPr>
+          <w:rFonts w:ascii="inherit" w:hAnsi="inherit"/>
+          <w:bdr w:val="none" w:sz="0" w:space="0" w:color="auto" w:frame="1"/>
+        </w:rPr>
+        <w:t>Afficher le comportement à adopter :</w:t>
+      </w:r>
+    </w:p>
+    <w:p>
+      <w:pPr>
+        <w:numPr>
+          <w:ilvl w:val="0"/>
+          <w:numId w:val="14"/>
+        </w:numPr>
+        <w:spacing w:line="240" w:lineRule="auto"/>
+        <w:ind w:left="0"/>
+        <w:textAlignment w:val="baseline"/>
+        <w:rPr>
+          <w:rFonts w:ascii="inherit" w:hAnsi="inherit"/>
+        </w:rPr>
+      </w:pPr>
+      <w:r>
+        <w:rPr>
+          <w:rFonts w:ascii="inherit" w:hAnsi="inherit"/>
+          <w:bdr w:val="none" w:sz="0" w:space="0" w:color="auto" w:frame="1"/>
+        </w:rPr>
+        <w:t>Rouge → Stop</w:t>
+      </w:r>
+    </w:p>
+    <w:p>
+      <w:pPr>
+        <w:numPr>
+          <w:ilvl w:val="0"/>
+          <w:numId w:val="14"/>
+        </w:numPr>
+        <w:spacing w:line="240" w:lineRule="auto"/>
+        <w:ind w:left="0"/>
+        <w:textAlignment w:val="baseline"/>
+        <w:rPr>
+          <w:rFonts w:ascii="inherit" w:hAnsi="inherit"/>
+        </w:rPr>
+      </w:pPr>
+      <w:r>
+        <w:rPr>
+          <w:rFonts w:ascii="inherit" w:hAnsi="inherit"/>
+          <w:bdr w:val="none" w:sz="0" w:space="0" w:color="auto" w:frame="1"/>
+        </w:rPr>
+        <w:t>Orange → Ralentir</w:t>
+      </w:r>
+    </w:p>
+    <w:p>
+      <w:pPr>
+        <w:numPr>
+          <w:ilvl w:val="0"/>
+          <w:numId w:val="14"/>
+        </w:numPr>
+        <w:spacing w:line="240" w:lineRule="auto"/>
+        <w:ind w:left="0"/>
+        <w:textAlignment w:val="baseline"/>
+        <w:rPr>
+          <w:rFonts w:ascii="inherit" w:hAnsi="inherit"/>
+        </w:rPr>
+      </w:pPr>
+      <w:r>
+        <w:rPr>
+          <w:rFonts w:ascii="inherit" w:hAnsi="inherit"/>
+          <w:bdr w:val="none" w:sz="0" w:space="0" w:color="auto" w:frame="1"/>
+        </w:rPr>
+        <w:t>Vert → Avancer</w:t>
+      </w:r>
+    </w:p>
+    <w:p>
+      <w:pPr>
+        <w:spacing w:line="240" w:lineRule="auto"/>
+        <w:textAlignment w:val="baseline"/>
+        <w:rPr>
+          <w:rFonts w:ascii="inherit" w:hAnsi="inherit"/>
+        </w:rPr>
+      </w:pPr>
+    </w:p>
+    <w:p>
+      <w:pPr>
+        <w:spacing w:line="240" w:lineRule="auto"/>
+        <w:textAlignment w:val="baseline"/>
+        <w:rPr>
+          <w:rFonts w:ascii="inherit" w:hAnsi="inherit"/>
+          <w:bdr w:val="none" w:sz="0" w:space="0" w:color="auto" w:frame="1"/>
+        </w:rPr>
+      </w:pPr>
+      <w:r>
+        <w:rPr>
+          <w:rFonts w:ascii="inherit" w:hAnsi="inherit"/>
+          <w:sz w:val="36"/>
+          <w:szCs w:val="36"/>
+          <w:bdr w:val="none" w:sz="0" w:space="0" w:color="auto" w:frame="1"/>
+        </w:rPr>
+        <w:t>Réponse</w:t>
+      </w:r>
+    </w:p>
+    <w:p/>
+    <w:p>
+      <w:pPr>
+        <w:pStyle w:val="Paragraphedeliste"/>
+        <w:numPr>
+          <w:ilvl w:val="0"/>
+          <w:numId w:val="15"/>
+        </w:numPr>
+      </w:pPr>
+      <w:r>
+        <w:t>Créer variable « couleur »</w:t>
+      </w:r>
+    </w:p>
+    <w:p>
+      <w:pPr>
+        <w:pStyle w:val="Paragraphedeliste"/>
+        <w:numPr>
+          <w:ilvl w:val="0"/>
+          <w:numId w:val="15"/>
+        </w:numPr>
+      </w:pPr>
+      <w:r>
+        <w:t>Demander couleur du feu</w:t>
+      </w:r>
+    </w:p>
+    <w:p>
+      <w:pPr>
+        <w:pStyle w:val="Paragraphedeliste"/>
+        <w:numPr>
+          <w:ilvl w:val="0"/>
+          <w:numId w:val="15"/>
+        </w:numPr>
+      </w:pPr>
+      <w:r>
+        <w:t xml:space="preserve">couleur </w:t>
+      </w:r>
+      <w:r>
+        <w:sym w:font="Wingdings" w:char="F0DF"/>
+      </w:r>
+      <w:r>
+        <w:t xml:space="preserve"> couleur du feu</w:t>
+      </w:r>
+    </w:p>
+    <w:p>
+      <w:pPr>
+        <w:pStyle w:val="Paragraphedeliste"/>
+        <w:numPr>
+          <w:ilvl w:val="0"/>
+          <w:numId w:val="15"/>
+        </w:numPr>
+      </w:pPr>
+      <w:r>
+        <w:t>Si couleur == Rouge</w:t>
+      </w:r>
+    </w:p>
+    <w:p>
+      <w:pPr>
+        <w:pStyle w:val="Paragraphedeliste"/>
+        <w:numPr>
+          <w:ilvl w:val="1"/>
+          <w:numId w:val="15"/>
+        </w:numPr>
+      </w:pPr>
+      <w:r>
+        <w:t>Afficher « Stop »</w:t>
+      </w:r>
+    </w:p>
+    <w:p>
+      <w:pPr>
+        <w:pStyle w:val="Paragraphedeliste"/>
+        <w:numPr>
+          <w:ilvl w:val="0"/>
+          <w:numId w:val="15"/>
+        </w:numPr>
+      </w:pPr>
+      <w:r>
+        <w:t>Sinon</w:t>
+      </w:r>
+      <w:r>
+        <w:t xml:space="preserve"> Si couleur == Orange</w:t>
+      </w:r>
+    </w:p>
+    <w:p>
+      <w:pPr>
+        <w:pStyle w:val="Paragraphedeliste"/>
+        <w:numPr>
+          <w:ilvl w:val="1"/>
+          <w:numId w:val="15"/>
+        </w:numPr>
+      </w:pPr>
+      <w:r>
+        <w:t>Afficher « Ralentir »</w:t>
+      </w:r>
+    </w:p>
+    <w:p>
+      <w:pPr>
+        <w:pStyle w:val="Paragraphedeliste"/>
+        <w:numPr>
+          <w:ilvl w:val="0"/>
+          <w:numId w:val="15"/>
+        </w:numPr>
+      </w:pPr>
+      <w:r>
+        <w:t>Sinon</w:t>
+      </w:r>
+    </w:p>
+    <w:p>
+      <w:pPr>
+        <w:pStyle w:val="Paragraphedeliste"/>
+        <w:numPr>
+          <w:ilvl w:val="1"/>
+          <w:numId w:val="15"/>
+        </w:numPr>
+      </w:pPr>
+      <w:r>
+        <w:t>Afficher « Avancer »</w:t>
+      </w:r>
+    </w:p>
+    <w:p>
+      <w:pPr>
+        <w:pStyle w:val="Paragraphedeliste"/>
+        <w:numPr>
+          <w:ilvl w:val="0"/>
+          <w:numId w:val="15"/>
+        </w:numPr>
+      </w:pPr>
+      <w:r>
+        <w:t>Fin Si</w:t>
+      </w:r>
       <w:bookmarkStart w:id="0" w:name="_GoBack"/>
       <w:bookmarkEnd w:id="0"/>
-    </w:p>
-    <w:p>
-      <w:pPr>
-        <w:spacing w:line="240" w:lineRule="auto"/>
-        <w:textAlignment w:val="baseline"/>
-        <w:rPr>
-          <w:rFonts w:ascii="inherit" w:hAnsi="inherit"/>
-        </w:rPr>
-      </w:pPr>
-    </w:p>
-    <w:p>
-      <w:pPr>
-        <w:pStyle w:val="Titre1"/>
-        <w:spacing w:before="0" w:after="0" w:line="330" w:lineRule="atLeast"/>
-        <w:textAlignment w:val="baseline"/>
-        <w:rPr>
-          <w:rFonts w:ascii="Helvetica" w:hAnsi="Helvetica"/>
-        </w:rPr>
-      </w:pPr>
-      <w:r>
-        <w:rPr>
-          <w:rFonts w:ascii="inherit" w:hAnsi="inherit"/>
-          <w:sz w:val="36"/>
-          <w:szCs w:val="36"/>
-          <w:bdr w:val="none" w:sz="0" w:space="0" w:color="auto" w:frame="1"/>
-        </w:rPr>
-        <w:t>Exercice 4 : Feu tricolore</w:t>
-      </w:r>
-    </w:p>
-    <w:p>
-      <w:pPr>
-        <w:rPr>
-          <w:rFonts w:ascii="Times New Roman" w:hAnsi="Times New Roman"/>
-        </w:rPr>
-      </w:pPr>
-      <w:r>
-        <w:rPr>
-          <w:rFonts w:ascii="Helvetica" w:hAnsi="Helvetica"/>
-          <w:bdr w:val="none" w:sz="0" w:space="0" w:color="auto" w:frame="1"/>
-        </w:rPr>
-        <w:t xml:space="preserve">Ecrire un algorithme en </w:t>
-      </w:r>
-      <w:proofErr w:type="spellStart"/>
-      <w:r>
-        <w:rPr>
-          <w:rFonts w:ascii="Helvetica" w:hAnsi="Helvetica"/>
-          <w:bdr w:val="none" w:sz="0" w:space="0" w:color="auto" w:frame="1"/>
-        </w:rPr>
-        <w:t>pseudo-code</w:t>
-      </w:r>
-      <w:proofErr w:type="spellEnd"/>
-      <w:r>
-        <w:rPr>
-          <w:rFonts w:ascii="Helvetica" w:hAnsi="Helvetica"/>
-          <w:bdr w:val="none" w:sz="0" w:space="0" w:color="auto" w:frame="1"/>
-        </w:rPr>
-        <w:t xml:space="preserve"> pour : </w:t>
-      </w:r>
-    </w:p>
-    <w:p>
-      <w:pPr>
-        <w:numPr>
-          <w:ilvl w:val="0"/>
-          <w:numId w:val="14"/>
-        </w:numPr>
-        <w:spacing w:line="240" w:lineRule="auto"/>
-        <w:ind w:left="0"/>
-        <w:textAlignment w:val="baseline"/>
-        <w:rPr>
-          <w:rFonts w:ascii="inherit" w:hAnsi="inherit"/>
-        </w:rPr>
-      </w:pPr>
-      <w:r>
-        <w:rPr>
-          <w:rFonts w:ascii="inherit" w:hAnsi="inherit"/>
-          <w:bdr w:val="none" w:sz="0" w:space="0" w:color="auto" w:frame="1"/>
-        </w:rPr>
-        <w:t>Entrée : couleur du feu</w:t>
-      </w:r>
-    </w:p>
-    <w:p>
-      <w:pPr>
-        <w:numPr>
-          <w:ilvl w:val="0"/>
-          <w:numId w:val="14"/>
-        </w:numPr>
-        <w:spacing w:line="240" w:lineRule="auto"/>
-        <w:ind w:left="0"/>
-        <w:textAlignment w:val="baseline"/>
-        <w:rPr>
-          <w:rFonts w:ascii="inherit" w:hAnsi="inherit"/>
-        </w:rPr>
-      </w:pPr>
-      <w:r>
-        <w:rPr>
-          <w:rFonts w:ascii="inherit" w:hAnsi="inherit"/>
-          <w:bdr w:val="none" w:sz="0" w:space="0" w:color="auto" w:frame="1"/>
-        </w:rPr>
-        <w:t>Afficher le comportement à adopter :</w:t>
-      </w:r>
-    </w:p>
-    <w:p>
-      <w:pPr>
-        <w:numPr>
-          <w:ilvl w:val="0"/>
-          <w:numId w:val="14"/>
-        </w:numPr>
-        <w:spacing w:line="240" w:lineRule="auto"/>
-        <w:ind w:left="0"/>
-        <w:textAlignment w:val="baseline"/>
-        <w:rPr>
-          <w:rFonts w:ascii="inherit" w:hAnsi="inherit"/>
-        </w:rPr>
-      </w:pPr>
-      <w:r>
-        <w:rPr>
-          <w:rFonts w:ascii="inherit" w:hAnsi="inherit"/>
-          <w:bdr w:val="none" w:sz="0" w:space="0" w:color="auto" w:frame="1"/>
-        </w:rPr>
-        <w:t>Rouge → Stop</w:t>
-      </w:r>
-    </w:p>
-    <w:p>
-      <w:pPr>
-        <w:numPr>
-          <w:ilvl w:val="0"/>
-          <w:numId w:val="14"/>
-        </w:numPr>
-        <w:spacing w:line="240" w:lineRule="auto"/>
-        <w:ind w:left="0"/>
-        <w:textAlignment w:val="baseline"/>
-        <w:rPr>
-          <w:rFonts w:ascii="inherit" w:hAnsi="inherit"/>
-        </w:rPr>
-      </w:pPr>
-      <w:r>
-        <w:rPr>
-          <w:rFonts w:ascii="inherit" w:hAnsi="inherit"/>
-          <w:bdr w:val="none" w:sz="0" w:space="0" w:color="auto" w:frame="1"/>
-        </w:rPr>
-        <w:t>Orange → Ralentir</w:t>
-      </w:r>
-    </w:p>
-    <w:p>
-      <w:pPr>
-        <w:numPr>
-          <w:ilvl w:val="0"/>
-          <w:numId w:val="14"/>
-        </w:numPr>
-        <w:spacing w:line="240" w:lineRule="auto"/>
-        <w:ind w:left="0"/>
-        <w:textAlignment w:val="baseline"/>
-        <w:rPr>
-          <w:rFonts w:ascii="inherit" w:hAnsi="inherit"/>
-        </w:rPr>
-      </w:pPr>
-      <w:r>
-        <w:rPr>
-          <w:rFonts w:ascii="inherit" w:hAnsi="inherit"/>
-          <w:bdr w:val="none" w:sz="0" w:space="0" w:color="auto" w:frame="1"/>
-        </w:rPr>
-        <w:t>Vert → Avancer</w:t>
-      </w:r>
-    </w:p>
-    <w:p>
-      <w:pPr>
-        <w:spacing w:line="240" w:lineRule="auto"/>
-        <w:textAlignment w:val="baseline"/>
-        <w:rPr>
-          <w:rFonts w:ascii="inherit" w:hAnsi="inherit"/>
-        </w:rPr>
-      </w:pPr>
-    </w:p>
-    <w:p>
-      <w:pPr>
-        <w:spacing w:line="240" w:lineRule="auto"/>
-        <w:textAlignment w:val="baseline"/>
-        <w:rPr>
-          <w:rFonts w:ascii="inherit" w:hAnsi="inherit"/>
-          <w:bdr w:val="none" w:sz="0" w:space="0" w:color="auto" w:frame="1"/>
-        </w:rPr>
-      </w:pPr>
-      <w:r>
-        <w:rPr>
-          <w:rFonts w:ascii="inherit" w:hAnsi="inherit"/>
-          <w:sz w:val="36"/>
-          <w:szCs w:val="36"/>
-          <w:bdr w:val="none" w:sz="0" w:space="0" w:color="auto" w:frame="1"/>
-        </w:rPr>
-        <w:t>Réponse</w:t>
-      </w:r>
-    </w:p>
-    <w:p/>
-    <w:p>
-      <w:pPr>
-        <w:pStyle w:val="Paragraphedeliste"/>
-        <w:numPr>
-          <w:ilvl w:val="0"/>
-          <w:numId w:val="15"/>
-        </w:numPr>
-      </w:pPr>
-      <w:r>
-        <w:t>Créer variable « couleur »</w:t>
-      </w:r>
-    </w:p>
-    <w:p>
-      <w:pPr>
-        <w:pStyle w:val="Paragraphedeliste"/>
-        <w:numPr>
-          <w:ilvl w:val="0"/>
-          <w:numId w:val="15"/>
-        </w:numPr>
-      </w:pPr>
-      <w:r>
-        <w:t>Demander couleur du feu</w:t>
-      </w:r>
-    </w:p>
-    <w:p>
-      <w:pPr>
-        <w:pStyle w:val="Paragraphedeliste"/>
-        <w:numPr>
-          <w:ilvl w:val="0"/>
-          <w:numId w:val="15"/>
-        </w:numPr>
-      </w:pPr>
-      <w:r>
-        <w:t xml:space="preserve">couleur </w:t>
-      </w:r>
-      <w:r>
-        <w:sym w:font="Wingdings" w:char="F0DF"/>
-      </w:r>
-      <w:r>
-        <w:t xml:space="preserve"> couleur du feu</w:t>
-      </w:r>
-    </w:p>
-    <w:p>
-      <w:pPr>
-        <w:pStyle w:val="Paragraphedeliste"/>
-        <w:numPr>
-          <w:ilvl w:val="0"/>
-          <w:numId w:val="15"/>
-        </w:numPr>
-      </w:pPr>
-      <w:r>
-        <w:t>Si couleur == Rouge</w:t>
-      </w:r>
-    </w:p>
-    <w:p>
-      <w:pPr>
-        <w:pStyle w:val="Paragraphedeliste"/>
-        <w:numPr>
-          <w:ilvl w:val="1"/>
-          <w:numId w:val="15"/>
-        </w:numPr>
-      </w:pPr>
-      <w:r>
-        <w:t>Afficher « Stop »</w:t>
-      </w:r>
-    </w:p>
-    <w:p>
-      <w:pPr>
-        <w:pStyle w:val="Paragraphedeliste"/>
-        <w:numPr>
-          <w:ilvl w:val="0"/>
-          <w:numId w:val="15"/>
-        </w:numPr>
-      </w:pPr>
-      <w:r>
-        <w:t>Sinon</w:t>
-      </w:r>
-      <w:r>
-        <w:t xml:space="preserve"> Si couleur == Orange</w:t>
-      </w:r>
-    </w:p>
-    <w:p>
-      <w:pPr>
-        <w:pStyle w:val="Paragraphedeliste"/>
-        <w:numPr>
-          <w:ilvl w:val="1"/>
-          <w:numId w:val="15"/>
-        </w:numPr>
-      </w:pPr>
-      <w:r>
-        <w:t>Afficher « Ralentir »</w:t>
-      </w:r>
-    </w:p>
-    <w:p>
-      <w:pPr>
-        <w:pStyle w:val="Paragraphedeliste"/>
-        <w:numPr>
-          <w:ilvl w:val="0"/>
-          <w:numId w:val="15"/>
-        </w:numPr>
-      </w:pPr>
-      <w:r>
-        <w:t>Sinon</w:t>
-      </w:r>
-    </w:p>
-    <w:p>
-      <w:pPr>
-        <w:pStyle w:val="Paragraphedeliste"/>
-        <w:numPr>
-          <w:ilvl w:val="1"/>
-          <w:numId w:val="15"/>
-        </w:numPr>
-      </w:pPr>
-      <w:r>
-        <w:t>Afficher « Avancer »</w:t>
-      </w:r>
     </w:p>
     <w:p/>
     <w:sectPr>

</xml_diff>